<commit_message>
feat(gate-mechanical): GATE-25-E2E mandatory for frontend/mixed atoms
- sub-skills/gate-mechanical/SKILL.md: add GATE-25-E2E row; document
  orchestrator must npm-ci + boot stack + healthcheck before Playwright
- scripts/mechanical/e2e-playwright.sh: auto-install node_modules,
  boot backend+frontend if not reachable, wait HTTP 200; declared-but-
  disabled E2E on UI atom now FAIL (was N/A) per LAW-F6
- docs/ubs.md: mirror rule in boss-facing charter with post-mortem
  citation (atom 260527-0141-youtube-like-share)
- docs/deploy-runbook.md: ship Stage 6.5 deploy runbook artifact

Justification: atom 260527-0141 produced three browser-visible bugs
(fail-to-load-feed from missing CORS, watch crash from Next.js 14
use(params) mis-use, ambiguous Upload locator) that prior skill version
declared GATE-25-E2E in the orchestrator table but never executed in
mechanical-gate sub-skill. Closes that hole.

Meta-gate suite: 7/7 PASS post-patch.
</commit_message>
<xml_diff>
--- a/docs/ubs.docx
+++ b/docs/ubs.docx
@@ -5163,6 +5163,109 @@
       </w:r>
       <w:r>
         <w:t xml:space="preserve">. Required for any atom touching the FE+BE seam.</w:t>
+      </w:r>
+      <w:r>
+        <w:t xml:space="preserve"> </w:t>
+      </w:r>
+      <w:r>
+        <w:rPr>
+          <w:b/>
+          <w:bCs/>
+        </w:rPr>
+        <w:t xml:space="preserve">MANDATORY (v8.5.1, 2026-05-27) for</w:t>
+      </w:r>
+      <w:r>
+        <w:rPr>
+          <w:b/>
+          <w:bCs/>
+        </w:rPr>
+        <w:t xml:space="preserve"> </w:t>
+      </w:r>
+      <w:r>
+        <w:rPr>
+          <w:rStyle w:val="VerbatimChar"/>
+          <w:b/>
+          <w:bCs/>
+        </w:rPr>
+        <w:t xml:space="preserve">project_type ∈ {frontend, mixed}</w:t>
+      </w:r>
+      <w:r>
+        <w:t xml:space="preserve">:</w:t>
+      </w:r>
+      <w:r>
+        <w:t xml:space="preserve"> </w:t>
+      </w:r>
+      <w:r>
+        <w:rPr>
+          <w:rStyle w:val="VerbatimChar"/>
+        </w:rPr>
+        <w:t xml:space="preserve">e2e.enabled = false</w:t>
+      </w:r>
+      <w:r>
+        <w:t xml:space="preserve"> </w:t>
+      </w:r>
+      <w:r>
+        <w:t xml:space="preserve">is no longer a valid N/A — it is FAIL by LAW-F6. Runner script (</w:t>
+      </w:r>
+      <w:r>
+        <w:rPr>
+          <w:rStyle w:val="VerbatimChar"/>
+        </w:rPr>
+        <w:t xml:space="preserve">scripts/mechanical/e2e-playwright.sh</w:t>
+      </w:r>
+      <w:r>
+        <w:t xml:space="preserve">) MUST: (1) install frontend deps if</w:t>
+      </w:r>
+      <w:r>
+        <w:t xml:space="preserve"> </w:t>
+      </w:r>
+      <w:r>
+        <w:rPr>
+          <w:rStyle w:val="VerbatimChar"/>
+        </w:rPr>
+        <w:t xml:space="preserve">node_modules/</w:t>
+      </w:r>
+      <w:r>
+        <w:t xml:space="preserve"> </w:t>
+      </w:r>
+      <w:r>
+        <w:t xml:space="preserve">absent, (2) boot backend + frontend if not already reachable, (3) wait for both to return 200, (4) execute</w:t>
+      </w:r>
+      <w:r>
+        <w:t xml:space="preserve"> </w:t>
+      </w:r>
+      <w:r>
+        <w:rPr>
+          <w:rStyle w:val="VerbatimChar"/>
+        </w:rPr>
+        <w:t xml:space="preserve">npx playwright test</w:t>
+      </w:r>
+      <w:r>
+        <w:t xml:space="preserve">, (5) FAIL on any vacuous run (0 passed AND 0 failed) or non-zero exit. Justification: atom 260527-0141 (</w:t>
+      </w:r>
+      <w:r>
+        <w:rPr>
+          <w:rStyle w:val="VerbatimChar"/>
+        </w:rPr>
+        <w:t xml:space="preserve">youtube-like-share</w:t>
+      </w:r>
+      <w:r>
+        <w:t xml:space="preserve">) post-mortem showed three browser-visible bugs (fail-to-load-feed from missing CORS, watch page crash from Next.js 14</w:t>
+      </w:r>
+      <w:r>
+        <w:t xml:space="preserve"> </w:t>
+      </w:r>
+      <w:r>
+        <w:rPr>
+          <w:rStyle w:val="VerbatimChar"/>
+        </w:rPr>
+        <w:t xml:space="preserve">use()</w:t>
+      </w:r>
+      <w:r>
+        <w:t xml:space="preserve"> </w:t>
+      </w:r>
+      <w:r>
+        <w:t xml:space="preserve">mis-use, ambiguous "Upload" locator) that a declared-but-skipped Playwright step would not have caught. Declared-only is now banned.</w:t>
       </w:r>
     </w:p>
     <w:p>

</xml_diff>

<commit_message>
feat: v9.0 LAW-COV-EXEC — coverage PASS must be executed, not self-reported
GATE-IMPL: self-report coverage now requires GATE-10 machine corroboration
(>0 instrumented lines); uncorroborated -> N/A_PENDING_REVIEWER, never PASS.
GATE-10: port total==0 vacuous guard to python/go/rust (0 tests != 100%).
GATE-11: tool-absent on critical atoms (scale+/realtime) -> FAIL not silent N/A.
Adds meta/coverage-trust-test.sh (6 red-team cases); meta suite 27/27.
Closes FB-clone field report: 100% FE+BE coverage on a dead backend.
</commit_message>
<xml_diff>
--- a/docs/ubs.docx
+++ b/docs/ubs.docx
@@ -1106,7 +1106,23 @@
         <w:t xml:space="preserve"> </w:t>
       </w:r>
       <w:r>
-        <w:t xml:space="preserve">(LAW-RT-PROPAGATE, LAW-CALL, LAW-BEHAVIORAL-MUSTHAVE) — inviolable. Violation = atom HALT + automation-ladder demotion.</w:t>
+        <w:t xml:space="preserve">(LAW-RT-PROPAGATE, LAW-CALL, LAW-BEHAVIORAL-MUSTHAVE) +</w:t>
+      </w:r>
+      <w:r>
+        <w:t xml:space="preserve"> </w:t>
+      </w:r>
+      <w:r>
+        <w:rPr>
+          <w:b/>
+          <w:bCs/>
+        </w:rPr>
+        <w:t xml:space="preserve">1 v9.0 coverage-trust law</w:t>
+      </w:r>
+      <w:r>
+        <w:t xml:space="preserve"> </w:t>
+      </w:r>
+      <w:r>
+        <w:t xml:space="preserve">(LAW-COV-EXEC) — inviolable. Violation = atom HALT + automation-ladder demotion.</w:t>
       </w:r>
     </w:p>
     <w:p>
@@ -4054,6 +4070,190 @@
       </w:r>
     </w:p>
     <w:p>
+      <w:pPr>
+        <w:pStyle w:val="BodyText"/>
+      </w:pPr>
+      <w:r>
+        <w:rPr>
+          <w:b/>
+          <w:bCs/>
+        </w:rPr>
+        <w:t xml:space="preserve">v9.0 trustworthy-coverage law.</w:t>
+      </w:r>
+      <w:r>
+        <w:t xml:space="preserve"> </w:t>
+      </w:r>
+      <w:r>
+        <w:t xml:space="preserve">This closes the 2026-06 Facebook-clone field report: the coverage verdict could read 100% (FE</w:t>
+      </w:r>
+      <w:r>
+        <w:t xml:space="preserve"> </w:t>
+      </w:r>
+      <w:r>
+        <w:rPr>
+          <w:i/>
+          <w:iCs/>
+        </w:rPr>
+        <w:t xml:space="preserve">and</w:t>
+      </w:r>
+      <w:r>
+        <w:t xml:space="preserve"> </w:t>
+      </w:r>
+      <w:r>
+        <w:t xml:space="preserve">BE) on a backend that never booted, because (a) GATE-IMPL certified coverage from agent-self-reported persona status files (no test ever ran), and (b) GATE-10 measured one whole-repo stack with a vacuous-PASS hole on python/go/rust — 100% of zero tests.</w:t>
+      </w:r>
+    </w:p>
+    <w:p>
+      <w:pPr>
+        <w:pStyle w:val="BodyText"/>
+      </w:pPr>
+      <w:r>
+        <w:rPr>
+          <w:b/>
+          <w:bCs/>
+        </w:rPr>
+        <w:t xml:space="preserve">LAW-COV-EXEC COVERAGE ⇒ EXECUTED, NOT SELF-REPORTED</w:t>
+      </w:r>
+      <w:r>
+        <w:t xml:space="preserve"> </w:t>
+      </w:r>
+      <w:r>
+        <w:t xml:space="preserve">— a coverage PASS MUST trace to a machine-produced coverage report over &gt; 0 instrumented lines; an agent's self-report is a claim, never evidence. Concretely: (a) GATE-IMPL (Stage 4) may not PASS on persona</w:t>
+      </w:r>
+      <w:r>
+        <w:t xml:space="preserve"> </w:t>
+      </w:r>
+      <w:r>
+        <w:rPr>
+          <w:rStyle w:val="VerbatimChar"/>
+        </w:rPr>
+        <w:t xml:space="preserve">*-status.json</w:t>
+      </w:r>
+      <w:r>
+        <w:t xml:space="preserve"> </w:t>
+      </w:r>
+      <w:r>
+        <w:t xml:space="preserve">claims when tests were dispatched against declared</w:t>
+      </w:r>
+      <w:r>
+        <w:t xml:space="preserve"> </w:t>
+      </w:r>
+      <w:r>
+        <w:rPr>
+          <w:rStyle w:val="VerbatimChar"/>
+        </w:rPr>
+        <w:t xml:space="preserve">core_flows[]</w:t>
+      </w:r>
+      <w:r>
+        <w:t xml:space="preserve"> </w:t>
+      </w:r>
+      <w:r>
+        <w:t xml:space="preserve">unless the machine coverage gate (GATE-10) produced a real PASS for that atom — absent / N/A / 0-instrumented machine coverage ⇒</w:t>
+      </w:r>
+      <w:r>
+        <w:t xml:space="preserve"> </w:t>
+      </w:r>
+      <w:r>
+        <w:rPr>
+          <w:rStyle w:val="VerbatimChar"/>
+        </w:rPr>
+        <w:t xml:space="preserve">N/A_PENDING_REVIEWER</w:t>
+      </w:r>
+      <w:r>
+        <w:t xml:space="preserve">, never a self-report PASS; (b) GATE-10 emits</w:t>
+      </w:r>
+      <w:r>
+        <w:t xml:space="preserve"> </w:t>
+      </w:r>
+      <w:r>
+        <w:rPr>
+          <w:rStyle w:val="VerbatimChar"/>
+        </w:rPr>
+        <w:t xml:space="preserve">N/A_PENDING_REVIEWER</w:t>
+      </w:r>
+      <w:r>
+        <w:t xml:space="preserve"> </w:t>
+      </w:r>
+      <w:r>
+        <w:t xml:space="preserve">(not a number) on EVERY stack when 0 statements were instrumented or no report was produced — the node</w:t>
+      </w:r>
+      <w:r>
+        <w:t xml:space="preserve"> </w:t>
+      </w:r>
+      <w:r>
+        <w:rPr>
+          <w:rStyle w:val="VerbatimChar"/>
+        </w:rPr>
+        <w:t xml:space="preserve">total==0</w:t>
+      </w:r>
+      <w:r>
+        <w:t xml:space="preserve"> </w:t>
+      </w:r>
+      <w:r>
+        <w:t xml:space="preserve">guard now also covers python/go/rust, so pytest collecting 0 tests no longer reads as 100%; (c) the mutation gate (GATE-11) — the catcher for assert-nothing tests — may not silently degrade to N/A on a CRITICAL atom (</w:t>
+      </w:r>
+      <w:r>
+        <w:rPr>
+          <w:rStyle w:val="VerbatimChar"/>
+        </w:rPr>
+        <w:t xml:space="preserve">scale_tier ∈ {scale, hyperscale}</w:t>
+      </w:r>
+      <w:r>
+        <w:t xml:space="preserve">, realtime-class product, or</w:t>
+      </w:r>
+      <w:r>
+        <w:t xml:space="preserve"> </w:t>
+      </w:r>
+      <w:r>
+        <w:rPr>
+          <w:rStyle w:val="VerbatimChar"/>
+        </w:rPr>
+        <w:t xml:space="preserve">gates.mechanical.mutation_tool_required=true</w:t>
+      </w:r>
+      <w:r>
+        <w:t xml:space="preserve">) when its tool is absent: there a missing tool is FAIL. Strengthens LAW-11 + LAW-F6: a gate that certifies coverage it never executed is the worst vacuous PASS. Enforced by GATE-IMPL (</w:t>
+      </w:r>
+      <w:r>
+        <w:rPr>
+          <w:rStyle w:val="VerbatimChar"/>
+        </w:rPr>
+        <w:t xml:space="preserve">scripts/implementer/implementer-coverage-gate.sh</w:t>
+      </w:r>
+      <w:r>
+        <w:t xml:space="preserve">), GATE-10 (</w:t>
+      </w:r>
+      <w:r>
+        <w:rPr>
+          <w:rStyle w:val="VerbatimChar"/>
+        </w:rPr>
+        <w:t xml:space="preserve">scripts/mechanical/coverage-check.sh</w:t>
+      </w:r>
+      <w:r>
+        <w:t xml:space="preserve">), GATE-11 (</w:t>
+      </w:r>
+      <w:r>
+        <w:rPr>
+          <w:rStyle w:val="VerbatimChar"/>
+        </w:rPr>
+        <w:t xml:space="preserve">scripts/mechanical/mutation-test.sh</w:t>
+      </w:r>
+      <w:r>
+        <w:t xml:space="preserve">); inversion-tested by</w:t>
+      </w:r>
+      <w:r>
+        <w:t xml:space="preserve"> </w:t>
+      </w:r>
+      <w:r>
+        <w:rPr>
+          <w:rStyle w:val="VerbatimChar"/>
+        </w:rPr>
+        <w:t xml:space="preserve">meta/coverage-trust-test.sh</w:t>
+      </w:r>
+      <w:r>
+        <w:t xml:space="preserve">.</w:t>
+      </w:r>
+    </w:p>
+    <w:p>
       <w:r>
         <w:pict>
           <v:rect style="width:0;height:1.5pt" o:hralign="center" o:hrstd="t" o:hr="t"/>
@@ -4748,7 +4948,38 @@
         <w:t xml:space="preserve"> </w:t>
       </w:r>
       <w:r>
-        <w:t xml:space="preserve">— line ≥ T1 AND branch ≥ T2. Script:</w:t>
+        <w:t xml:space="preserve">— line ≥ T1 AND branch ≥ T2.</w:t>
+      </w:r>
+      <w:r>
+        <w:t xml:space="preserve"> </w:t>
+      </w:r>
+      <w:r>
+        <w:rPr>
+          <w:b/>
+          <w:bCs/>
+        </w:rPr>
+        <w:t xml:space="preserve">v9.0 (LAW-COV-EXEC):</w:t>
+      </w:r>
+      <w:r>
+        <w:t xml:space="preserve"> </w:t>
+      </w:r>
+      <w:r>
+        <w:t xml:space="preserve">0 instrumented statements / no report produced ⇒</w:t>
+      </w:r>
+      <w:r>
+        <w:t xml:space="preserve"> </w:t>
+      </w:r>
+      <w:r>
+        <w:rPr>
+          <w:rStyle w:val="VerbatimChar"/>
+        </w:rPr>
+        <w:t xml:space="preserve">N/A_PENDING_REVIEWER</w:t>
+      </w:r>
+      <w:r>
+        <w:t xml:space="preserve"> </w:t>
+      </w:r>
+      <w:r>
+        <w:t xml:space="preserve">on every stack (node/python/go/rust) — 100%-of-zero-tests is never a PASS. Script:</w:t>
       </w:r>
       <w:r>
         <w:t xml:space="preserve"> </w:t>
@@ -8593,7 +8824,59 @@
         <w:t xml:space="preserve"> </w:t>
       </w:r>
       <w:r>
-        <w:t xml:space="preserve">collapse to single-persona; the gate still enforces files-changed ⊆ allowlist. Script:</w:t>
+        <w:t xml:space="preserve">collapse to single-persona; the gate still enforces files-changed ⊆ allowlist.</w:t>
+      </w:r>
+      <w:r>
+        <w:t xml:space="preserve"> </w:t>
+      </w:r>
+      <w:r>
+        <w:rPr>
+          <w:b/>
+          <w:bCs/>
+        </w:rPr>
+        <w:t xml:space="preserve">v9.0 (LAW-COV-EXEC):</w:t>
+      </w:r>
+      <w:r>
+        <w:t xml:space="preserve"> </w:t>
+      </w:r>
+      <w:r>
+        <w:t xml:space="preserve">when tests were dispatched against declared</w:t>
+      </w:r>
+      <w:r>
+        <w:t xml:space="preserve"> </w:t>
+      </w:r>
+      <w:r>
+        <w:rPr>
+          <w:rStyle w:val="VerbatimChar"/>
+        </w:rPr>
+        <w:t xml:space="preserve">core_flows[]</w:t>
+      </w:r>
+      <w:r>
+        <w:t xml:space="preserve">, a clean persona self-report is NOT sufficient for PASS — it MUST be corroborated by a real GATE-10 machine coverage PASS (&gt;0 instrumented lines). Uncorroborated (GATE-10 absent / N/A / 0-instrumented) ⇒</w:t>
+      </w:r>
+      <w:r>
+        <w:t xml:space="preserve"> </w:t>
+      </w:r>
+      <w:r>
+        <w:rPr>
+          <w:rStyle w:val="VerbatimChar"/>
+        </w:rPr>
+        <w:t xml:space="preserve">N/A_PENDING_REVIEWER</w:t>
+      </w:r>
+      <w:r>
+        <w:t xml:space="preserve">, never a PASS on self-reported</w:t>
+      </w:r>
+      <w:r>
+        <w:t xml:space="preserve"> </w:t>
+      </w:r>
+      <w:r>
+        <w:rPr>
+          <w:rStyle w:val="VerbatimChar"/>
+        </w:rPr>
+        <w:t xml:space="preserve">core_flows_covered[]</w:t>
+      </w:r>
+      <w:r>
+        <w:t xml:space="preserve">. This closes the FB-clone "100% FE+BE on a dead backend" hole. Script:</w:t>
       </w:r>
       <w:r>
         <w:t xml:space="preserve"> </w:t>

</xml_diff>

<commit_message>
feat: v9.0 LAW-RT-DERIVE — realtime gate eligibility from features, not product name
GATE-RT-PROPAGATE now derives realtime-class from declared feature_surface[]
+ core_flows[] (chat/messaging/presence/live-notif/collab), not just the product
name regex — so a 'facebook'/'social-network' build with a messaging feature can
no longer skip the multi-client proof (went silently N/A before).
Adds references/tech-packs/websocket-realtime.md and wires it into the implementer
dispatch + dev-backend/dev-frontend personas (curated realtime how-to, not model
memory). Fixes gate-mechanical doc-drift (RT-PROPAGATE + CALL rows).
realtime-propagation-test +2 cases (feature-derived FAIL, no false-positive); 27/27 meta.
</commit_message>
<xml_diff>
--- a/docs/ubs.docx
+++ b/docs/ubs.docx
@@ -1116,13 +1116,13 @@
           <w:b/>
           <w:bCs/>
         </w:rPr>
-        <w:t xml:space="preserve">1 v9.0 coverage-trust law</w:t>
-      </w:r>
-      <w:r>
-        <w:t xml:space="preserve"> </w:t>
-      </w:r>
-      <w:r>
-        <w:t xml:space="preserve">(LAW-COV-EXEC) — inviolable. Violation = atom HALT + automation-ladder demotion.</w:t>
+        <w:t xml:space="preserve">2 v9.0 laws</w:t>
+      </w:r>
+      <w:r>
+        <w:t xml:space="preserve"> </w:t>
+      </w:r>
+      <w:r>
+        <w:t xml:space="preserve">(LAW-COV-EXEC coverage-trust, LAW-RT-DERIVE realtime-from-features) — inviolable. Violation = atom HALT + automation-ladder demotion.</w:t>
       </w:r>
     </w:p>
     <w:p>
@@ -3820,211 +3820,32 @@
         <w:t xml:space="preserve"> </w:t>
       </w:r>
       <w:r>
-        <w:t xml:space="preserve">is FAIL (declared-but-skipped); enabled with zero journeys is FAIL (no vacuous pass); login/users/selectors undeclared ⇒ N/A_PENDING_REVIEWER (undrivable — reviewer verifies). A single-client optimistic-UI echo is NOT proof. Enforced by GATE-RT-PROPAGATE (</w:t>
-      </w:r>
-      <w:r>
-        <w:rPr>
-          <w:rStyle w:val="VerbatimChar"/>
-        </w:rPr>
-        <w:t xml:space="preserve">scripts/mechanical/e2e-multiclient.sh</w:t>
-      </w:r>
-      <w:r>
-        <w:t xml:space="preserve">).</w:t>
-      </w:r>
-    </w:p>
-    <w:p>
-      <w:pPr>
-        <w:pStyle w:val="BodyText"/>
-      </w:pPr>
+        <w:t xml:space="preserve">is FAIL (declared-but-skipped); enabled with zero journeys is FAIL (no vacuous pass); login/users/selectors undeclared ⇒ N/A_PENDING_REVIEWER (undrivable — reviewer verifies). A single-client optimistic-UI echo is NOT proof.</w:t>
+      </w:r>
+      <w:r>
+        <w:t xml:space="preserve"> </w:t>
+      </w:r>
       <w:r>
         <w:rPr>
           <w:b/>
           <w:bCs/>
         </w:rPr>
-        <w:t xml:space="preserve">LAW-CALL CALL ⇒ CONNECTS</w:t>
-      </w:r>
-      <w:r>
-        <w:t xml:space="preserve"> </w:t>
-      </w:r>
-      <w:r>
-        <w:t xml:space="preserve">— where a call surface exists, a working call MUST be proven, not merely present. GATE-CALL is mandatory when ANY holds: (a) a call feature is declared in</w:t>
-      </w:r>
-      <w:r>
-        <w:t xml:space="preserve"> </w:t>
-      </w:r>
-      <w:r>
-        <w:rPr>
-          <w:rStyle w:val="VerbatimChar"/>
-        </w:rPr>
-        <w:t xml:space="preserve">feature_surface</w:t>
-      </w:r>
-      <w:r>
-        <w:t xml:space="preserve">; (b) archetype</w:t>
-      </w:r>
-      <w:r>
-        <w:t xml:space="preserve"> </w:t>
-      </w:r>
-      <w:r>
-        <w:rPr>
-          <w:rStyle w:val="VerbatimChar"/>
-        </w:rPr>
-        <w:t xml:space="preserve">chat-app</w:t>
-      </w:r>
-      <w:r>
-        <w:t xml:space="preserve"> </w:t>
-      </w:r>
-      <w:r>
-        <w:t xml:space="preserve">at</w:t>
-      </w:r>
-      <w:r>
-        <w:t xml:space="preserve"> </w:t>
-      </w:r>
-      <w:r>
-        <w:rPr>
-          <w:rStyle w:val="VerbatimChar"/>
-        </w:rPr>
-        <w:t xml:space="preserve">scale_tier ∈ {scale, hyperscale}</w:t>
-      </w:r>
-      <w:r>
-        <w:t xml:space="preserve">; (c) the built UI exposes a call surface (≥2 corroborating signals: route + symbol/label, word-boundary anchored). A skill-authored fake-media probe opens two clients, A starts → B answers, and BOTH</w:t>
-      </w:r>
-      <w:r>
-        <w:t xml:space="preserve"> </w:t>
-      </w:r>
-      <w:r>
-        <w:rPr>
-          <w:rStyle w:val="VerbatimChar"/>
-        </w:rPr>
-        <w:t xml:space="preserve">RTCPeerConnection.connectionState</w:t>
-      </w:r>
-      <w:r>
-        <w:t xml:space="preserve"> </w:t>
-      </w:r>
-      <w:r>
-        <w:t xml:space="preserve">MUST reach</w:t>
-      </w:r>
-      <w:r>
-        <w:t xml:space="preserve"> </w:t>
-      </w:r>
-      <w:r>
-        <w:rPr>
-          <w:rStyle w:val="VerbatimChar"/>
-        </w:rPr>
-        <w:t xml:space="preserve">connected</w:t>
-      </w:r>
-      <w:r>
-        <w:t xml:space="preserve"> </w:t>
-      </w:r>
-      <w:r>
-        <w:t xml:space="preserve">within budget with ≥1 live remote track. A present-but-dead call button = FAIL. The app MUST expose its active</w:t>
-      </w:r>
-      <w:r>
-        <w:t xml:space="preserve"> </w:t>
-      </w:r>
-      <w:r>
-        <w:rPr>
-          <w:rStyle w:val="VerbatimChar"/>
-        </w:rPr>
-        <w:t xml:space="preserve">RTCPeerConnection</w:t>
-      </w:r>
-      <w:r>
-        <w:t xml:space="preserve"> </w:t>
-      </w:r>
-      <w:r>
-        <w:t xml:space="preserve">at</w:t>
-      </w:r>
-      <w:r>
-        <w:t xml:space="preserve"> </w:t>
-      </w:r>
-      <w:r>
-        <w:rPr>
-          <w:rStyle w:val="VerbatimChar"/>
-        </w:rPr>
-        <w:t xml:space="preserve">call.peer_accessor</w:t>
-      </w:r>
-      <w:r>
-        <w:t xml:space="preserve"> </w:t>
-      </w:r>
-      <w:r>
-        <w:t xml:space="preserve">(default</w:t>
-      </w:r>
-      <w:r>
-        <w:t xml:space="preserve"> </w:t>
-      </w:r>
-      <w:r>
-        <w:rPr>
-          <w:rStyle w:val="VerbatimChar"/>
-        </w:rPr>
-        <w:t xml:space="preserve">window.__rtcPeer</w:t>
-      </w:r>
-      <w:r>
-        <w:t xml:space="preserve">) under the E2E flag; absent ⇒ N/A_PENDING_REVIEWER (never silent PASS).</w:t>
-      </w:r>
-      <w:r>
-        <w:t xml:space="preserve"> </w:t>
-      </w:r>
-      <w:r>
-        <w:rPr>
-          <w:rStyle w:val="VerbatimChar"/>
-        </w:rPr>
-        <w:t xml:space="preserve">realtime_media</w:t>
-      </w:r>
-      <w:r>
-        <w:t xml:space="preserve"> </w:t>
-      </w:r>
-      <w:r>
-        <w:t xml:space="preserve">becomes a required capability whenever GATE-CALL is mandatory. Escape hatch:</w:t>
-      </w:r>
-      <w:r>
-        <w:t xml:space="preserve"> </w:t>
-      </w:r>
-      <w:r>
-        <w:rPr>
-          <w:rStyle w:val="VerbatimChar"/>
-        </w:rPr>
-        <w:t xml:space="preserve">call.ui_autodetect:false</w:t>
-      </w:r>
-      <w:r>
-        <w:t xml:space="preserve"> </w:t>
-      </w:r>
-      <w:r>
-        <w:t xml:space="preserve">REQUIRES a</w:t>
-      </w:r>
-      <w:r>
-        <w:t xml:space="preserve"> </w:t>
-      </w:r>
-      <w:r>
-        <w:rPr>
-          <w:rStyle w:val="VerbatimChar"/>
-        </w:rPr>
-        <w:t xml:space="preserve">call.ui_autodetect_reason</w:t>
-      </w:r>
-      <w:r>
-        <w:t xml:space="preserve"> </w:t>
-      </w:r>
-      <w:r>
-        <w:t xml:space="preserve">(LAW-F6). Enforced by GATE-CALL (</w:t>
-      </w:r>
-      <w:r>
-        <w:rPr>
-          <w:rStyle w:val="VerbatimChar"/>
-        </w:rPr>
-        <w:t xml:space="preserve">scripts/mechanical/e2e-call.sh</w:t>
-      </w:r>
-      <w:r>
-        <w:t xml:space="preserve">), GATE-WIRE-STACK, and</w:t>
-      </w:r>
-      <w:r>
-        <w:t xml:space="preserve"> </w:t>
-      </w:r>
-      <w:r>
-        <w:rPr>
-          <w:rStyle w:val="VerbatimChar"/>
-        </w:rPr>
-        <w:t xml:space="preserve">scripts/spec/call-surface-detect.sh</w:t>
-      </w:r>
-      <w:r>
-        <w:t xml:space="preserve">.</w:t>
+        <w:t xml:space="preserve">v9.0:</w:t>
+      </w:r>
+      <w:r>
+        <w:t xml:space="preserve"> </w:t>
+      </w:r>
+      <w:r>
+        <w:t xml:space="preserve">realtime-class eligibility also derives from declared features, not just the product name — see LAW-RT-DERIVE. Enforced by GATE-RT-PROPAGATE (</w:t>
+      </w:r>
+      <w:r>
+        <w:rPr>
+          <w:rStyle w:val="VerbatimChar"/>
+        </w:rPr>
+        <w:t xml:space="preserve">scripts/mechanical/e2e-multiclient.sh</w:t>
+      </w:r>
+      <w:r>
+        <w:t xml:space="preserve">).</w:t>
       </w:r>
     </w:p>
     <w:p>
@@ -4036,37 +3857,190 @@
           <w:b/>
           <w:bCs/>
         </w:rPr>
-        <w:t xml:space="preserve">LAW-BEHAVIORAL-MUSTHAVE INTERACTIVE ⇒ BEHAVIORAL PASS</w:t>
-      </w:r>
-      <w:r>
-        <w:t xml:space="preserve"> </w:t>
-      </w:r>
-      <w:r>
-        <w:t xml:space="preserve">— a must-have feature catalog-tagged</w:t>
-      </w:r>
-      <w:r>
-        <w:t xml:space="preserve"> </w:t>
-      </w:r>
-      <w:r>
-        <w:rPr>
-          <w:rStyle w:val="VerbatimChar"/>
-        </w:rPr>
-        <w:t xml:space="preserve">behavioral:&lt;gate&gt;</w:t>
-      </w:r>
-      <w:r>
-        <w:t xml:space="preserve"> </w:t>
-      </w:r>
-      <w:r>
-        <w:t xml:space="preserve">(realtime messaging, presence, live collaborative editing, calls) MUST have its mapped behavioral gate verdict = PASS. Static route + handler + test-file existence (GATE-PFC-WIRE) is necessary but NOT sufficient for these. Behavioral FAIL ⇒ FAIL; behavioral N/A or not-run ⇒ N/A (never upgraded to PASS). Enforced by GATE-BEHAVIORAL-MUSTHAVE (</w:t>
-      </w:r>
-      <w:r>
-        <w:rPr>
-          <w:rStyle w:val="VerbatimChar"/>
-        </w:rPr>
-        <w:t xml:space="preserve">scripts/spec/behavioral-binding-check.sh</w:t>
-      </w:r>
-      <w:r>
-        <w:t xml:space="preserve">).</w:t>
+        <w:t xml:space="preserve">LAW-CALL CALL ⇒ CONNECTS</w:t>
+      </w:r>
+      <w:r>
+        <w:t xml:space="preserve"> </w:t>
+      </w:r>
+      <w:r>
+        <w:t xml:space="preserve">— where a call surface exists, a working call MUST be proven, not merely present. GATE-CALL is mandatory when ANY holds: (a) a call feature is declared in</w:t>
+      </w:r>
+      <w:r>
+        <w:t xml:space="preserve"> </w:t>
+      </w:r>
+      <w:r>
+        <w:rPr>
+          <w:rStyle w:val="VerbatimChar"/>
+        </w:rPr>
+        <w:t xml:space="preserve">feature_surface</w:t>
+      </w:r>
+      <w:r>
+        <w:t xml:space="preserve">; (b) archetype</w:t>
+      </w:r>
+      <w:r>
+        <w:t xml:space="preserve"> </w:t>
+      </w:r>
+      <w:r>
+        <w:rPr>
+          <w:rStyle w:val="VerbatimChar"/>
+        </w:rPr>
+        <w:t xml:space="preserve">chat-app</w:t>
+      </w:r>
+      <w:r>
+        <w:t xml:space="preserve"> </w:t>
+      </w:r>
+      <w:r>
+        <w:t xml:space="preserve">at</w:t>
+      </w:r>
+      <w:r>
+        <w:t xml:space="preserve"> </w:t>
+      </w:r>
+      <w:r>
+        <w:rPr>
+          <w:rStyle w:val="VerbatimChar"/>
+        </w:rPr>
+        <w:t xml:space="preserve">scale_tier ∈ {scale, hyperscale}</w:t>
+      </w:r>
+      <w:r>
+        <w:t xml:space="preserve">; (c) the built UI exposes a call surface (≥2 corroborating signals: route + symbol/label, word-boundary anchored). A skill-authored fake-media probe opens two clients, A starts → B answers, and BOTH</w:t>
+      </w:r>
+      <w:r>
+        <w:t xml:space="preserve"> </w:t>
+      </w:r>
+      <w:r>
+        <w:rPr>
+          <w:rStyle w:val="VerbatimChar"/>
+        </w:rPr>
+        <w:t xml:space="preserve">RTCPeerConnection.connectionState</w:t>
+      </w:r>
+      <w:r>
+        <w:t xml:space="preserve"> </w:t>
+      </w:r>
+      <w:r>
+        <w:t xml:space="preserve">MUST reach</w:t>
+      </w:r>
+      <w:r>
+        <w:t xml:space="preserve"> </w:t>
+      </w:r>
+      <w:r>
+        <w:rPr>
+          <w:rStyle w:val="VerbatimChar"/>
+        </w:rPr>
+        <w:t xml:space="preserve">connected</w:t>
+      </w:r>
+      <w:r>
+        <w:t xml:space="preserve"> </w:t>
+      </w:r>
+      <w:r>
+        <w:t xml:space="preserve">within budget with ≥1 live remote track. A present-but-dead call button = FAIL. The app MUST expose its active</w:t>
+      </w:r>
+      <w:r>
+        <w:t xml:space="preserve"> </w:t>
+      </w:r>
+      <w:r>
+        <w:rPr>
+          <w:rStyle w:val="VerbatimChar"/>
+        </w:rPr>
+        <w:t xml:space="preserve">RTCPeerConnection</w:t>
+      </w:r>
+      <w:r>
+        <w:t xml:space="preserve"> </w:t>
+      </w:r>
+      <w:r>
+        <w:t xml:space="preserve">at</w:t>
+      </w:r>
+      <w:r>
+        <w:t xml:space="preserve"> </w:t>
+      </w:r>
+      <w:r>
+        <w:rPr>
+          <w:rStyle w:val="VerbatimChar"/>
+        </w:rPr>
+        <w:t xml:space="preserve">call.peer_accessor</w:t>
+      </w:r>
+      <w:r>
+        <w:t xml:space="preserve"> </w:t>
+      </w:r>
+      <w:r>
+        <w:t xml:space="preserve">(default</w:t>
+      </w:r>
+      <w:r>
+        <w:t xml:space="preserve"> </w:t>
+      </w:r>
+      <w:r>
+        <w:rPr>
+          <w:rStyle w:val="VerbatimChar"/>
+        </w:rPr>
+        <w:t xml:space="preserve">window.__rtcPeer</w:t>
+      </w:r>
+      <w:r>
+        <w:t xml:space="preserve">) under the E2E flag; absent ⇒ N/A_PENDING_REVIEWER (never silent PASS).</w:t>
+      </w:r>
+      <w:r>
+        <w:t xml:space="preserve"> </w:t>
+      </w:r>
+      <w:r>
+        <w:rPr>
+          <w:rStyle w:val="VerbatimChar"/>
+        </w:rPr>
+        <w:t xml:space="preserve">realtime_media</w:t>
+      </w:r>
+      <w:r>
+        <w:t xml:space="preserve"> </w:t>
+      </w:r>
+      <w:r>
+        <w:t xml:space="preserve">becomes a required capability whenever GATE-CALL is mandatory. Escape hatch:</w:t>
+      </w:r>
+      <w:r>
+        <w:t xml:space="preserve"> </w:t>
+      </w:r>
+      <w:r>
+        <w:rPr>
+          <w:rStyle w:val="VerbatimChar"/>
+        </w:rPr>
+        <w:t xml:space="preserve">call.ui_autodetect:false</w:t>
+      </w:r>
+      <w:r>
+        <w:t xml:space="preserve"> </w:t>
+      </w:r>
+      <w:r>
+        <w:t xml:space="preserve">REQUIRES a</w:t>
+      </w:r>
+      <w:r>
+        <w:t xml:space="preserve"> </w:t>
+      </w:r>
+      <w:r>
+        <w:rPr>
+          <w:rStyle w:val="VerbatimChar"/>
+        </w:rPr>
+        <w:t xml:space="preserve">call.ui_autodetect_reason</w:t>
+      </w:r>
+      <w:r>
+        <w:t xml:space="preserve"> </w:t>
+      </w:r>
+      <w:r>
+        <w:t xml:space="preserve">(LAW-F6). Enforced by GATE-CALL (</w:t>
+      </w:r>
+      <w:r>
+        <w:rPr>
+          <w:rStyle w:val="VerbatimChar"/>
+        </w:rPr>
+        <w:t xml:space="preserve">scripts/mechanical/e2e-call.sh</w:t>
+      </w:r>
+      <w:r>
+        <w:t xml:space="preserve">), GATE-WIRE-STACK, and</w:t>
+      </w:r>
+      <w:r>
+        <w:t xml:space="preserve"> </w:t>
+      </w:r>
+      <w:r>
+        <w:rPr>
+          <w:rStyle w:val="VerbatimChar"/>
+        </w:rPr>
+        <w:t xml:space="preserve">scripts/spec/call-surface-detect.sh</w:t>
+      </w:r>
+      <w:r>
+        <w:t xml:space="preserve">.</w:t>
       </w:r>
     </w:p>
     <w:p>
@@ -4078,6 +4052,48 @@
           <w:b/>
           <w:bCs/>
         </w:rPr>
+        <w:t xml:space="preserve">LAW-BEHAVIORAL-MUSTHAVE INTERACTIVE ⇒ BEHAVIORAL PASS</w:t>
+      </w:r>
+      <w:r>
+        <w:t xml:space="preserve"> </w:t>
+      </w:r>
+      <w:r>
+        <w:t xml:space="preserve">— a must-have feature catalog-tagged</w:t>
+      </w:r>
+      <w:r>
+        <w:t xml:space="preserve"> </w:t>
+      </w:r>
+      <w:r>
+        <w:rPr>
+          <w:rStyle w:val="VerbatimChar"/>
+        </w:rPr>
+        <w:t xml:space="preserve">behavioral:&lt;gate&gt;</w:t>
+      </w:r>
+      <w:r>
+        <w:t xml:space="preserve"> </w:t>
+      </w:r>
+      <w:r>
+        <w:t xml:space="preserve">(realtime messaging, presence, live collaborative editing, calls) MUST have its mapped behavioral gate verdict = PASS. Static route + handler + test-file existence (GATE-PFC-WIRE) is necessary but NOT sufficient for these. Behavioral FAIL ⇒ FAIL; behavioral N/A or not-run ⇒ N/A (never upgraded to PASS). Enforced by GATE-BEHAVIORAL-MUSTHAVE (</w:t>
+      </w:r>
+      <w:r>
+        <w:rPr>
+          <w:rStyle w:val="VerbatimChar"/>
+        </w:rPr>
+        <w:t xml:space="preserve">scripts/spec/behavioral-binding-check.sh</w:t>
+      </w:r>
+      <w:r>
+        <w:t xml:space="preserve">).</w:t>
+      </w:r>
+    </w:p>
+    <w:p>
+      <w:pPr>
+        <w:pStyle w:val="BodyText"/>
+      </w:pPr>
+      <w:r>
+        <w:rPr>
+          <w:b/>
+          <w:bCs/>
+        </w:rPr>
         <w:t xml:space="preserve">v9.0 trustworthy-coverage law.</w:t>
       </w:r>
       <w:r>
@@ -4251,6 +4267,226 @@
       </w:r>
       <w:r>
         <w:t xml:space="preserve">.</w:t>
+      </w:r>
+    </w:p>
+    <w:p>
+      <w:pPr>
+        <w:pStyle w:val="BodyText"/>
+      </w:pPr>
+      <w:r>
+        <w:rPr>
+          <w:b/>
+          <w:bCs/>
+        </w:rPr>
+        <w:t xml:space="preserve">v9.0 realtime-reach.</w:t>
+      </w:r>
+      <w:r>
+        <w:t xml:space="preserve"> </w:t>
+      </w:r>
+      <w:r>
+        <w:t xml:space="preserve">Same field report: the multi-client proof (GATE-RT-PROPAGATE, v8.9) was correct but never</w:t>
+      </w:r>
+      <w:r>
+        <w:t xml:space="preserve"> </w:t>
+      </w:r>
+      <w:r>
+        <w:rPr>
+          <w:i/>
+          <w:iCs/>
+        </w:rPr>
+        <w:t xml:space="preserve">fired</w:t>
+      </w:r>
+      <w:r>
+        <w:t xml:space="preserve"> </w:t>
+      </w:r>
+      <w:r>
+        <w:t xml:space="preserve">for the Facebook clone — eligibility keyed on the product NAME (</w:t>
+      </w:r>
+      <w:r>
+        <w:rPr>
+          <w:rStyle w:val="VerbatimChar"/>
+        </w:rPr>
+        <w:t xml:space="preserve">*chat*|*messag*|…</w:t>
+      </w:r>
+      <w:r>
+        <w:t xml:space="preserve">), and "facebook" / "social-network" matched nothing, so its Messenger feature went N/A and shipped unproven. Separately, implementer personas received no realtime how-to and coded sockets from memory (the repeated WebSocket bugs).</w:t>
+      </w:r>
+    </w:p>
+    <w:p>
+      <w:pPr>
+        <w:pStyle w:val="BodyText"/>
+      </w:pPr>
+      <w:r>
+        <w:rPr>
+          <w:b/>
+          <w:bCs/>
+        </w:rPr>
+        <w:t xml:space="preserve">LAW-RT-DERIVE REALTIME ELIGIBILITY FROM FEATURES, NOT NAME</w:t>
+      </w:r>
+      <w:r>
+        <w:t xml:space="preserve"> </w:t>
+      </w:r>
+      <w:r>
+        <w:t xml:space="preserve">— GATE-RT-PROPAGATE eligibility is derived from declared</w:t>
+      </w:r>
+      <w:r>
+        <w:t xml:space="preserve"> </w:t>
+      </w:r>
+      <w:r>
+        <w:rPr>
+          <w:rStyle w:val="VerbatimChar"/>
+        </w:rPr>
+        <w:t xml:space="preserve">feature_surface[].name</w:t>
+      </w:r>
+      <w:r>
+        <w:t xml:space="preserve"> </w:t>
+      </w:r>
+      <w:r>
+        <w:t xml:space="preserve">+</w:t>
+      </w:r>
+      <w:r>
+        <w:t xml:space="preserve"> </w:t>
+      </w:r>
+      <w:r>
+        <w:rPr>
+          <w:rStyle w:val="VerbatimChar"/>
+        </w:rPr>
+        <w:t xml:space="preserve">core_flows[]</w:t>
+      </w:r>
+      <w:r>
+        <w:t xml:space="preserve"> </w:t>
+      </w:r>
+      <w:r>
+        <w:t xml:space="preserve">(keywords: chat, messaging, presence, typing, live feed/update/notification, collaborative/co-edit, websocket), in addition to the product-name regex and explicit</w:t>
+      </w:r>
+      <w:r>
+        <w:t xml:space="preserve"> </w:t>
+      </w:r>
+      <w:r>
+        <w:rPr>
+          <w:rStyle w:val="VerbatimChar"/>
+        </w:rPr>
+        <w:t xml:space="preserve">realtime.enabled</w:t>
+      </w:r>
+      <w:r>
+        <w:t xml:space="preserve">. A build whose features include a realtime-class capability but leaves</w:t>
+      </w:r>
+      <w:r>
+        <w:t xml:space="preserve"> </w:t>
+      </w:r>
+      <w:r>
+        <w:rPr>
+          <w:rStyle w:val="VerbatimChar"/>
+        </w:rPr>
+        <w:t xml:space="preserve">realtime.enabled != true</w:t>
+      </w:r>
+      <w:r>
+        <w:t xml:space="preserve"> </w:t>
+      </w:r>
+      <w:r>
+        <w:t xml:space="preserve">is FAIL (the proof may not be silently skipped because the product happens to be</w:t>
+      </w:r>
+      <w:r>
+        <w:t xml:space="preserve"> </w:t>
+      </w:r>
+      <w:r>
+        <w:rPr>
+          <w:i/>
+          <w:iCs/>
+        </w:rPr>
+        <w:t xml:space="preserve">named</w:t>
+      </w:r>
+      <w:r>
+        <w:t xml:space="preserve"> </w:t>
+      </w:r>
+      <w:r>
+        <w:t xml:space="preserve">something the regex missed). Pairs with the implementer</w:t>
+      </w:r>
+      <w:r>
+        <w:t xml:space="preserve"> </w:t>
+      </w:r>
+      <w:r>
+        <w:rPr>
+          <w:b/>
+          <w:bCs/>
+        </w:rPr>
+        <w:t xml:space="preserve">tech-pack</w:t>
+      </w:r>
+      <w:r>
+        <w:t xml:space="preserve"> </w:t>
+      </w:r>
+      <w:r>
+        <w:t xml:space="preserve">mechanism: when the stack/features declare realtime, the dispatcher MUST hand</w:t>
+      </w:r>
+      <w:r>
+        <w:t xml:space="preserve"> </w:t>
+      </w:r>
+      <w:r>
+        <w:rPr>
+          <w:rStyle w:val="VerbatimChar"/>
+        </w:rPr>
+        <w:t xml:space="preserve">references/tech-packs/websocket-realtime.md</w:t>
+      </w:r>
+      <w:r>
+        <w:t xml:space="preserve"> </w:t>
+      </w:r>
+      <w:r>
+        <w:t xml:space="preserve">(auth-on-upgrade, reconnect+resync, heartbeat, room scoping, idempotent + persisted delivery, optimistic-send reconcile, E2E drivability) to the Dev-Backend + Dev-Frontend personas. Enforced by GATE-RT-PROPAGATE (</w:t>
+      </w:r>
+      <w:r>
+        <w:rPr>
+          <w:rStyle w:val="VerbatimChar"/>
+        </w:rPr>
+        <w:t xml:space="preserve">scripts/mechanical/e2e-multiclient.sh</w:t>
+      </w:r>
+      <w:r>
+        <w:t xml:space="preserve">); inversion-tested by</w:t>
+      </w:r>
+      <w:r>
+        <w:t xml:space="preserve"> </w:t>
+      </w:r>
+      <w:r>
+        <w:rPr>
+          <w:rStyle w:val="VerbatimChar"/>
+        </w:rPr>
+        <w:t xml:space="preserve">meta/realtime-propagation-test.sh</w:t>
+      </w:r>
+      <w:r>
+        <w:t xml:space="preserve"> </w:t>
+      </w:r>
+      <w:r>
+        <w:t xml:space="preserve">(cases 6–7: feature-derived FAIL + no-false-positive N/A).</w:t>
+      </w:r>
+      <w:r>
+        <w:t xml:space="preserve"> </w:t>
+      </w:r>
+      <w:r>
+        <w:rPr>
+          <w:i/>
+          <w:iCs/>
+        </w:rPr>
+        <w:t xml:space="preserve">Deferred to v9.0.1:</w:t>
+      </w:r>
+      <w:r>
+        <w:t xml:space="preserve"> </w:t>
+      </w:r>
+      <w:r>
+        <w:t xml:space="preserve">auto-deriving</w:t>
+      </w:r>
+      <w:r>
+        <w:t xml:space="preserve"> </w:t>
+      </w:r>
+      <w:r>
+        <w:rPr>
+          <w:rStyle w:val="VerbatimChar"/>
+        </w:rPr>
+        <w:t xml:space="preserve">realtime.{enabled,journeys}</w:t>
+      </w:r>
+      <w:r>
+        <w:t xml:space="preserve"> </w:t>
+      </w:r>
+      <w:r>
+        <w:t xml:space="preserve">from features (selector inference) — until then the feature-derived FAIL forces the builder to declare the probe config.</w:t>
       </w:r>
     </w:p>
     <w:p>

</xml_diff>

<commit_message>
feat: v9.0 LAW-INTENT-DEFAULT — archetype default-and-proceed (no question storm)
A known-archetype prompt (e.g. 'build facebook') now pre-fills declared.* from a
curated catalog (scripts/intent/archetype-defaults.json) and records an
agent-default-archetype history entry that satisfies the feature-surface
confirmation guard WITHOUT an interactive round -> intent READY in one pass, zero
questions (was: 7-field probe + 10-20-item mandatory interview). Defaults are
explicit + user-overridable (edit declared.* or re-run --interactive), so LAW-F6
holds. Reconciles 'never stop mid-flow' with LAW-CL-95.
Adds meta/intent-default-proceed-test.sh (4 cases); meta suite 28/28.
</commit_message>
<xml_diff>
--- a/docs/ubs.docx
+++ b/docs/ubs.docx
@@ -1116,13 +1116,13 @@
           <w:b/>
           <w:bCs/>
         </w:rPr>
-        <w:t xml:space="preserve">2 v9.0 laws</w:t>
-      </w:r>
-      <w:r>
-        <w:t xml:space="preserve"> </w:t>
-      </w:r>
-      <w:r>
-        <w:t xml:space="preserve">(LAW-COV-EXEC coverage-trust, LAW-RT-DERIVE realtime-from-features) — inviolable. Violation = atom HALT + automation-ladder demotion.</w:t>
+        <w:t xml:space="preserve">3 v9.0 laws</w:t>
+      </w:r>
+      <w:r>
+        <w:t xml:space="preserve"> </w:t>
+      </w:r>
+      <w:r>
+        <w:t xml:space="preserve">(LAW-COV-EXEC coverage-trust, LAW-RT-DERIVE realtime-from-features, LAW-INTENT-DEFAULT archetype default-and-proceed) — inviolable. Violation = atom HALT + automation-ladder demotion.</w:t>
       </w:r>
     </w:p>
     <w:p>
@@ -4487,6 +4487,209 @@
       </w:r>
       <w:r>
         <w:t xml:space="preserve">from features (selector inference) — until then the feature-derived FAIL forces the builder to declare the probe config.</w:t>
+      </w:r>
+    </w:p>
+    <w:p>
+      <w:pPr>
+        <w:pStyle w:val="BodyText"/>
+      </w:pPr>
+      <w:r>
+        <w:rPr>
+          <w:b/>
+          <w:bCs/>
+        </w:rPr>
+        <w:t xml:space="preserve">v9.0 intent ergonomics.</w:t>
+      </w:r>
+      <w:r>
+        <w:t xml:space="preserve"> </w:t>
+      </w:r>
+      <w:r>
+        <w:t xml:space="preserve">Same field report: a bare</w:t>
+      </w:r>
+      <w:r>
+        <w:t xml:space="preserve"> </w:t>
+      </w:r>
+      <w:r>
+        <w:rPr>
+          <w:rStyle w:val="VerbatimChar"/>
+        </w:rPr>
+        <w:t xml:space="preserve">build facebook</w:t>
+      </w:r>
+      <w:r>
+        <w:t xml:space="preserve"> </w:t>
+      </w:r>
+      <w:r>
+        <w:t xml:space="preserve">triggered a fixed 7-field probe plus a mandatory 10–20-item feature-enumeration interview that the vacuous-PASS guard refused to skip ("took all day to answer"). This also exposed a standing conflict — the operating rule "never stop mid-flow to confirm" vs LAW-CL-95 / LAW-INTENT-FS, which</w:t>
+      </w:r>
+      <w:r>
+        <w:t xml:space="preserve"> </w:t>
+      </w:r>
+      <w:r>
+        <w:rPr>
+          <w:i/>
+          <w:iCs/>
+        </w:rPr>
+        <w:t xml:space="preserve">mandate</w:t>
+      </w:r>
+      <w:r>
+        <w:t xml:space="preserve"> </w:t>
+      </w:r>
+      <w:r>
+        <w:t xml:space="preserve">the interactive feature-confirmation stop.</w:t>
+      </w:r>
+    </w:p>
+    <w:p>
+      <w:pPr>
+        <w:pStyle w:val="BodyText"/>
+      </w:pPr>
+      <w:r>
+        <w:rPr>
+          <w:b/>
+          <w:bCs/>
+        </w:rPr>
+        <w:t xml:space="preserve">LAW-INTENT-DEFAULT KNOWN ARCHETYPE ⇒ DEFAULT-AND-PROCEED</w:t>
+      </w:r>
+      <w:r>
+        <w:t xml:space="preserve"> </w:t>
+      </w:r>
+      <w:r>
+        <w:t xml:space="preserve">— when the raw prompt matches a curated archetype (</w:t>
+      </w:r>
+      <w:r>
+        <w:rPr>
+          <w:rStyle w:val="VerbatimChar"/>
+        </w:rPr>
+        <w:t xml:space="preserve">scripts/intent/archetype-defaults.json</w:t>
+      </w:r>
+      <w:r>
+        <w:t xml:space="preserve">) and intent runs WITHOUT</w:t>
+      </w:r>
+      <w:r>
+        <w:t xml:space="preserve"> </w:t>
+      </w:r>
+      <w:r>
+        <w:rPr>
+          <w:rStyle w:val="VerbatimChar"/>
+        </w:rPr>
+        <w:t xml:space="preserve">--interactive</w:t>
+      </w:r>
+      <w:r>
+        <w:t xml:space="preserve">, Stage 0.1 pre-fills</w:t>
+      </w:r>
+      <w:r>
+        <w:t xml:space="preserve"> </w:t>
+      </w:r>
+      <w:r>
+        <w:rPr>
+          <w:rStyle w:val="VerbatimChar"/>
+        </w:rPr>
+        <w:t xml:space="preserve">declared.*</w:t>
+      </w:r>
+      <w:r>
+        <w:t xml:space="preserve"> </w:t>
+      </w:r>
+      <w:r>
+        <w:t xml:space="preserve">(product_type, primary_user, core_flows, success_criteria, scale_tier, cost, feature_surface) from the catalog and records an</w:t>
+      </w:r>
+      <w:r>
+        <w:t xml:space="preserve"> </w:t>
+      </w:r>
+      <w:r>
+        <w:rPr>
+          <w:rStyle w:val="VerbatimChar"/>
+        </w:rPr>
+        <w:t xml:space="preserve">agent-default-archetype</w:t>
+      </w:r>
+      <w:r>
+        <w:t xml:space="preserve"> </w:t>
+      </w:r>
+      <w:r>
+        <w:t xml:space="preserve">history entry. That entry satisfies the feature-surface confirmation guard (LAW-INTENT-FS) WITHOUT an interactive round —</w:t>
+      </w:r>
+      <w:r>
+        <w:t xml:space="preserve"> </w:t>
+      </w:r>
+      <w:r>
+        <w:rPr>
+          <w:rStyle w:val="VerbatimChar"/>
+        </w:rPr>
+        <w:t xml:space="preserve">build facebook</w:t>
+      </w:r>
+      <w:r>
+        <w:t xml:space="preserve"> </w:t>
+      </w:r>
+      <w:r>
+        <w:t xml:space="preserve">reaches READY in one pass, zero questions. This is NOT a vacuous PASS: the defaults are an explicit, recorded, user-overridable known-product spec (edit</w:t>
+      </w:r>
+      <w:r>
+        <w:t xml:space="preserve"> </w:t>
+      </w:r>
+      <w:r>
+        <w:rPr>
+          <w:rStyle w:val="VerbatimChar"/>
+        </w:rPr>
+        <w:t xml:space="preserve">declared.*</w:t>
+      </w:r>
+      <w:r>
+        <w:t xml:space="preserve"> </w:t>
+      </w:r>
+      <w:r>
+        <w:t xml:space="preserve">or re-run</w:t>
+      </w:r>
+      <w:r>
+        <w:t xml:space="preserve"> </w:t>
+      </w:r>
+      <w:r>
+        <w:rPr>
+          <w:rStyle w:val="VerbatimChar"/>
+        </w:rPr>
+        <w:t xml:space="preserve">--interactive</w:t>
+      </w:r>
+      <w:r>
+        <w:t xml:space="preserve"> </w:t>
+      </w:r>
+      <w:r>
+        <w:t xml:space="preserve">for the full interview), not a silent empty inference — so LAW-F6 holds in spirit. The catalog is small + high-confidence; an unmatched prompt falls through to the full probe + interview unchanged. This is the sanctioned reconciliation of "never stop mid-flow" with LAW-CL-95: the stop is replaced by recorded, overridable provenance, not skipped silently. Enforced by</w:t>
+      </w:r>
+      <w:r>
+        <w:t xml:space="preserve"> </w:t>
+      </w:r>
+      <w:r>
+        <w:rPr>
+          <w:rStyle w:val="VerbatimChar"/>
+        </w:rPr>
+        <w:t xml:space="preserve">scripts/intent/declare-intent.sh</w:t>
+      </w:r>
+      <w:r>
+        <w:t xml:space="preserve">; inversion-tested by</w:t>
+      </w:r>
+      <w:r>
+        <w:t xml:space="preserve"> </w:t>
+      </w:r>
+      <w:r>
+        <w:rPr>
+          <w:rStyle w:val="VerbatimChar"/>
+        </w:rPr>
+        <w:t xml:space="preserve">meta/intent-default-proceed-test.sh</w:t>
+      </w:r>
+      <w:r>
+        <w:t xml:space="preserve">.</w:t>
+      </w:r>
+      <w:r>
+        <w:t xml:space="preserve"> </w:t>
+      </w:r>
+      <w:r>
+        <w:rPr>
+          <w:i/>
+          <w:iCs/>
+        </w:rPr>
+        <w:t xml:space="preserve">Deferred to v9.0.1:</w:t>
+      </w:r>
+      <w:r>
+        <w:t xml:space="preserve"> </w:t>
+      </w:r>
+      <w:r>
+        <w:t xml:space="preserve">broadening the archetype catalog beyond the seed set.</w:t>
       </w:r>
     </w:p>
     <w:p>

</xml_diff>